<commit_message>
Add the site_administrator role; allow merging one person's duplicate staff accounts; require a child safety officer at onboarding
Co-Authored-By: Claude Sonnet 5.5 <noreply@anthropic.com>
</commit_message>
<xml_diff>
--- a/docs/Child-Safeguarding-Policy.docx
+++ b/docs/Child-Safeguarding-Policy.docx
@@ -36,7 +36,7 @@
         <w:rPr>
           <w:b/>
         </w:rPr>
-        <w:t>Child-protection lead:</w:t>
+        <w:t>Child safety officer (child-protection lead):</w:t>
       </w:r>
       <w:r>
         <w:t xml:space="preserve"> Confidence Onuoha, +234 806 417 7653 (call or WhatsApp), confidenceonuoha416@gmail.com. </w:t>
@@ -54,6 +54,20 @@
     <w:p>
       <w:r>
         <w:t>Version 1, 17 October 2026. To be adopted by the child-protection lead and the platform owner, reviewed once a year, and reviewed by a lawyer for each country where we work (see the legal review brief).</w:t>
+      </w:r>
+    </w:p>
+    <w:p>
+      <w:r>
+        <w:t xml:space="preserve">Every organization we work with must name a </w:t>
+      </w:r>
+      <w:r>
+        <w:rPr>
+          <w:b/>
+        </w:rPr>
+        <w:t>child safety officer</w:t>
+      </w:r>
+      <w:r>
+        <w:t xml:space="preserve"> before any child is enrolled. At the Davidson AI Futures Lab it is Confidence Onuoha. In this policy "child-protection lead" and "child safety officer" mean the same person.</w:t>
       </w:r>
     </w:p>
     <w:p>
@@ -930,7 +944,63 @@
               <w:rPr>
                 <w:sz w:val="18"/>
               </w:rPr>
-              <w:t>Organization's child-protection contact</w:t>
+              <w:t>Organization's child safety officer (required)</w:t>
+            </w:r>
+          </w:p>
+        </w:tc>
+        <w:tc>
+          <w:tcPr>
+            <w:tcW w:type="dxa" w:w="2353"/>
+          </w:tcPr>
+          <w:p>
+            <w:r>
+              <w:rPr>
+                <w:sz w:val="18"/>
+              </w:rPr>
+            </w:r>
+          </w:p>
+        </w:tc>
+        <w:tc>
+          <w:tcPr>
+            <w:tcW w:type="dxa" w:w="2353"/>
+          </w:tcPr>
+          <w:p>
+            <w:r>
+              <w:rPr>
+                <w:sz w:val="18"/>
+              </w:rPr>
+            </w:r>
+          </w:p>
+        </w:tc>
+        <w:tc>
+          <w:tcPr>
+            <w:tcW w:type="dxa" w:w="2353"/>
+          </w:tcPr>
+          <w:p>
+            <w:r>
+              <w:rPr>
+                <w:sz w:val="18"/>
+              </w:rPr>
+            </w:r>
+          </w:p>
+        </w:tc>
+      </w:tr>
+      <w:tr>
+        <w:tc>
+          <w:tcPr>
+            <w:tcW w:type="dxa" w:w="2353"/>
+          </w:tcPr>
+          <w:p>
+            <w:r>
+              <w:rPr>
+                <w:sz w:val="18"/>
+              </w:rPr>
+            </w:r>
+            <w:r>
+              <w:rPr>
+                <w:sz w:val="18"/>
+              </w:rPr>
+              <w:t>Deputy child safety officer</w:t>
             </w:r>
           </w:p>
         </w:tc>

</xml_diff>

<commit_message>
Add the site_administrator role; allow merging one person's duplicate staff accounts; require a child safety officer at onboarding (#304)
Co-authored-by: Claude Sonnet 5.5 <noreply@anthropic.com>
</commit_message>
<xml_diff>
--- a/docs/Child-Safeguarding-Policy.docx
+++ b/docs/Child-Safeguarding-Policy.docx
@@ -36,7 +36,7 @@
         <w:rPr>
           <w:b/>
         </w:rPr>
-        <w:t>Child-protection lead:</w:t>
+        <w:t>Child safety officer (child-protection lead):</w:t>
       </w:r>
       <w:r>
         <w:t xml:space="preserve"> Confidence Onuoha, +234 806 417 7653 (call or WhatsApp), confidenceonuoha416@gmail.com. </w:t>
@@ -54,6 +54,20 @@
     <w:p>
       <w:r>
         <w:t>Version 1, 17 October 2026. To be adopted by the child-protection lead and the platform owner, reviewed once a year, and reviewed by a lawyer for each country where we work (see the legal review brief).</w:t>
+      </w:r>
+    </w:p>
+    <w:p>
+      <w:r>
+        <w:t xml:space="preserve">Every organization we work with must name a </w:t>
+      </w:r>
+      <w:r>
+        <w:rPr>
+          <w:b/>
+        </w:rPr>
+        <w:t>child safety officer</w:t>
+      </w:r>
+      <w:r>
+        <w:t xml:space="preserve"> before any child is enrolled. At the Davidson AI Futures Lab it is Confidence Onuoha. In this policy "child-protection lead" and "child safety officer" mean the same person.</w:t>
       </w:r>
     </w:p>
     <w:p>
@@ -930,7 +944,63 @@
               <w:rPr>
                 <w:sz w:val="18"/>
               </w:rPr>
-              <w:t>Organization's child-protection contact</w:t>
+              <w:t>Organization's child safety officer (required)</w:t>
+            </w:r>
+          </w:p>
+        </w:tc>
+        <w:tc>
+          <w:tcPr>
+            <w:tcW w:type="dxa" w:w="2353"/>
+          </w:tcPr>
+          <w:p>
+            <w:r>
+              <w:rPr>
+                <w:sz w:val="18"/>
+              </w:rPr>
+            </w:r>
+          </w:p>
+        </w:tc>
+        <w:tc>
+          <w:tcPr>
+            <w:tcW w:type="dxa" w:w="2353"/>
+          </w:tcPr>
+          <w:p>
+            <w:r>
+              <w:rPr>
+                <w:sz w:val="18"/>
+              </w:rPr>
+            </w:r>
+          </w:p>
+        </w:tc>
+        <w:tc>
+          <w:tcPr>
+            <w:tcW w:type="dxa" w:w="2353"/>
+          </w:tcPr>
+          <w:p>
+            <w:r>
+              <w:rPr>
+                <w:sz w:val="18"/>
+              </w:rPr>
+            </w:r>
+          </w:p>
+        </w:tc>
+      </w:tr>
+      <w:tr>
+        <w:tc>
+          <w:tcPr>
+            <w:tcW w:type="dxa" w:w="2353"/>
+          </w:tcPr>
+          <w:p>
+            <w:r>
+              <w:rPr>
+                <w:sz w:val="18"/>
+              </w:rPr>
+            </w:r>
+            <w:r>
+              <w:rPr>
+                <w:sz w:val="18"/>
+              </w:rPr>
+              <w:t>Deputy child safety officer</w:t>
             </w:r>
           </w:p>
         </w:tc>

</xml_diff>